<commit_message>
style: primeni stil-pisanja (TNR 12pt, potpis desno regular, separator pred predlog, naming konvencija)
</commit_message>
<xml_diff>
--- a/izvestaj/Praksa_1_VKS_Rev1_7-2017.docx
+++ b/izvestaj/Praksa_1_VKS_Rev1_7-2017.docx
@@ -202,7 +202,7 @@
     </w:p>
     <w:sectPr>
       <w:pgSz w:w="12240" w:h="15840"/>
-      <w:pgMar w:top="1440" w:right="1417" w:bottom="1440" w:left="1417" w:header="720" w:footer="720" w:gutter="0"/>
+      <w:pgMar w:top="1440" w:right="1440" w:bottom="1440" w:left="1440" w:header="720" w:footer="720" w:gutter="0"/>
       <w:cols w:space="720"/>
       <w:docGrid w:linePitch="360"/>
     </w:sectPr>
@@ -575,7 +575,7 @@
     <w:rsid w:val="00FC693F"/>
     <w:rPr>
       <w:rFonts w:ascii="Times New Roman" w:hAnsi="Times New Roman"/>
-      <w:sz w:val="22"/>
+      <w:sz w:val="24"/>
     </w:rPr>
   </w:style>
   <w:style w:type="paragraph" w:styleId="Header">

</xml_diff>